<commit_message>
Ajusta informe de Mike Bermeo con diseño, primer prompt y percepción del evaluador
Co-Authored-By: Claude Opus 5.5 <noreply@anthropic.com>
Claude-Session: https://claude.ai/code/session_01XoDZLsg3S6BNvJBdoo6Rq7
</commit_message>
<xml_diff>
--- a/informes/Informe_entrevista_Mike_Bermeo.docx
+++ b/informes/Informe_entrevista_Mike_Bermeo.docx
@@ -1519,7 +1519,7 @@
                 <w:sz w:val="22"/>
                 <w:szCs w:val="22"/>
               </w:rPr>
-              <w:t xml:space="preserve">PRÁCTICA 76 / 100</w:t>
+              <w:t xml:space="preserve">PRÁCTICA 71 / 100</w:t>
             </w:r>
           </w:p>
         </w:tc>
@@ -1885,7 +1885,7 @@
           <w:sz w:val="20"/>
           <w:szCs w:val="20"/>
         </w:rPr>
-        <w:t xml:space="preserve">La prueba práctica suma 76/100 (diseño 15/20, implementación 30/40, defensa 31/40). Entregó una solución funcional y desplegada, con la decisión bancaria aplicada en código: el modelo puede ser más conservador que la política, nunca menos. En la defensa explicó su solución con precisión y respondió con criterio sobre proveedores de modelos, observabilidad, RAG, datos sensibles y despliegue. Las brechas principales son la ausencia de autenticación y de control de acceso por cliente, la falta de mecanismos de resiliencia ante fallos del proveedor de modelos y el desconocimiento de algunos patrones de resiliencia y de diseño. La nota final queda pendiente de la evaluación teórica.</w:t>
+        <w:t xml:space="preserve">La prueba práctica suma 71/100 (diseño 12/20, implementación 30/40, defensa 29/40). Entregó una solución funcional y desplegada, con la decisión bancaria aplicada en código: el modelo puede ser más conservador que la política, nunca menos. En la defensa explicó su solución con precisión y respondió con criterio sobre proveedores de modelos, observabilidad, RAG, datos sensibles y despliegue. Las brechas principales son la ausencia de autenticación y de control de acceso por cliente, la falta de mecanismos de resiliencia ante fallos del proveedor de modelos, un diseño que describe el flujo de agentes sin capas de software, y fundamentos de ingeniería de software (patrones de diseño, arquitectura, patrones de resiliencia) en un nivel básico. La nota final queda pendiente de la evaluación teórica.</w:t>
       </w:r>
     </w:p>
     <w:p>
@@ -1917,7 +1917,7 @@
           <w:sz w:val="20"/>
           <w:szCs w:val="20"/>
         </w:rPr>
-        <w:t xml:space="preserve">Trabaja con el SDK de agentes de OpenAI, LangChain, LangGraph, LangSmith y Langfuse. Organizó el trabajo con una especificación de tareas, ramas de funcionalidad, pull requests y commits descriptivos. Conoce arquitectura hexagonal y desarrollo guiado por pruebas, y ha trabajado con monolitos y microservicios.</w:t>
+        <w:t xml:space="preserve">Trabaja con el SDK de agentes de OpenAI, LangChain, LangGraph, LangSmith y Langfuse. Generó la solución con un asistente de código: su primera instrucción entregó el diagrama, el enunciado y el stack (TypeScript, zod, SDK de OpenAI y un front sencillo), pidió que el orquestador controle a los sub-agentes, sus herramientas y prompts, y que se planificara la ejecución antes de programar. Luego trabajó con ramas, pull requests y commits descriptivos. Mencionó arquitectura hexagonal, MVC y desarrollo guiado por pruebas, con un dominio básico de los fundamentos de ingeniería de software.</w:t>
       </w:r>
     </w:p>
     <w:p>
@@ -2117,7 +2117,7 @@
                 <w:sz w:val="19"/>
                 <w:szCs w:val="19"/>
               </w:rPr>
-              <w:t xml:space="preserve">15 / 20</w:t>
+              <w:t xml:space="preserve">12 / 20</w:t>
             </w:r>
           </w:p>
         </w:tc>
@@ -2207,7 +2207,7 @@
                 <w:sz w:val="19"/>
                 <w:szCs w:val="19"/>
               </w:rPr>
-              <w:t xml:space="preserve">31 / 40</w:t>
+              <w:t xml:space="preserve">29 / 40</w:t>
             </w:r>
           </w:p>
         </w:tc>
@@ -2258,7 +2258,7 @@
                 <w:sz w:val="19"/>
                 <w:szCs w:val="19"/>
               </w:rPr>
-              <w:t xml:space="preserve">76 / 100</w:t>
+              <w:t xml:space="preserve">71 / 100</w:t>
             </w:r>
           </w:p>
         </w:tc>
@@ -2486,7 +2486,7 @@
                 <w:sz w:val="19"/>
                 <w:szCs w:val="19"/>
               </w:rPr>
-              <w:t xml:space="preserve">4 / 6</w:t>
+              <w:t xml:space="preserve">2 / 6</w:t>
             </w:r>
           </w:p>
         </w:tc>
@@ -2618,7 +2618,7 @@
                 <w:sz w:val="19"/>
                 <w:szCs w:val="19"/>
               </w:rPr>
-              <w:t xml:space="preserve">4 / 6</w:t>
+              <w:t xml:space="preserve">3 / 6</w:t>
             </w:r>
           </w:p>
         </w:tc>
@@ -2690,7 +2690,7 @@
                 <w:sz w:val="19"/>
                 <w:szCs w:val="19"/>
               </w:rPr>
-              <w:t xml:space="preserve">15 / 20</w:t>
+              <w:t xml:space="preserve">12 / 20</w:t>
             </w:r>
           </w:p>
         </w:tc>
@@ -3290,7 +3290,7 @@
                 <w:sz w:val="19"/>
                 <w:szCs w:val="19"/>
               </w:rPr>
-              <w:t xml:space="preserve">8 / 10</w:t>
+              <w:t xml:space="preserve">7 / 10</w:t>
             </w:r>
           </w:p>
         </w:tc>
@@ -3554,7 +3554,7 @@
                 <w:sz w:val="19"/>
                 <w:szCs w:val="19"/>
               </w:rPr>
-              <w:t xml:space="preserve">6 / 8</w:t>
+              <w:t xml:space="preserve">5 / 8</w:t>
             </w:r>
           </w:p>
         </w:tc>
@@ -3626,7 +3626,7 @@
                 <w:sz w:val="19"/>
                 <w:szCs w:val="19"/>
               </w:rPr>
-              <w:t xml:space="preserve">31 / 40</w:t>
+              <w:t xml:space="preserve">29 / 40</w:t>
             </w:r>
           </w:p>
         </w:tc>
@@ -3653,7 +3653,7 @@
           <w:sz w:val="22"/>
           <w:szCs w:val="22"/>
         </w:rPr>
-        <w:t xml:space="preserve">Diseño de arquitectura: 15 / 20</w:t>
+        <w:t xml:space="preserve">Diseño de arquitectura: 12 / 20</w:t>
       </w:r>
     </w:p>
     <w:p>
@@ -3669,7 +3669,7 @@
           <w:sz w:val="20"/>
           <w:szCs w:val="20"/>
         </w:rPr>
-        <w:t xml:space="preserve">Uso de capas (4/6). </w:t>
+        <w:t xml:space="preserve">Uso de capas (2/6). </w:t>
       </w:r>
       <w:r>
         <w:rPr>
@@ -3677,7 +3677,7 @@
           <w:sz w:val="20"/>
           <w:szCs w:val="20"/>
         </w:rPr>
-        <w:t xml:space="preserve">Separa el endpoint, el orquestador, los sub-agentes con sus herramientas y la política de negocio. El diagrama no incluye la capa de observabilidad, aunque la solución emite eventos de progreso.</w:t>
+        <w:t xml:space="preserve">El diagrama describe el flujo entre el orquestador, los cuatro sub-agentes (con su prompt y sus herramientas), el escalamiento a un humano y la respuesta al usuario. No representa capas de software (entrada, aplicación, dominio, infraestructura) ni componentes de seguridad, estado u observabilidad.</w:t>
       </w:r>
     </w:p>
     <w:p>
@@ -3717,7 +3717,7 @@
           <w:sz w:val="20"/>
           <w:szCs w:val="20"/>
         </w:rPr>
-        <w:t xml:space="preserve">Controles (4/6). </w:t>
+        <w:t xml:space="preserve">Controles (3/6). </w:t>
       </w:r>
       <w:r>
         <w:rPr>
@@ -3725,7 +3725,7 @@
           <w:sz w:val="20"/>
           <w:szCs w:val="20"/>
         </w:rPr>
-        <w:t xml:space="preserve">Define el control de herramientas por agente y una validación de la decisión contra la política. No incluye controles de resiliencia ante fallos del proveedor.</w:t>
+        <w:t xml:space="preserve">El diseño asigna a cada agente solo sus herramientas, prevé el escalamiento y propone pasar los datos del prospecto a los prompts como referencias. No incluye autenticación ni controles de resiliencia; la validación de la decisión contra la política aparece en el código, no en el diseño.</w:t>
       </w:r>
     </w:p>
     <w:p>
@@ -3863,7 +3863,7 @@
           <w:sz w:val="20"/>
           <w:szCs w:val="20"/>
         </w:rPr>
-        <w:t xml:space="preserve">Usa el SDK de OpenAI con un modelo mayor para el orquestador y uno menor para los sub-agentes, lo que reduce costo. No implementó reintentos, enrutamiento entre proveedores ni manejo de límites de tasa. La cédula viaja por el modelo para el control cruzado de argumentos.</w:t>
+        <w:t xml:space="preserve">Usa el SDK de OpenAI con un modelo mayor para el orquestador y uno menor para los sub-agentes, lo que reduce costo. No implementó reintentos, enrutamiento entre proveedores ni manejo de límites de tasa. Aunque el diseño plantea pasar los datos por referencia, en el código la cédula viaja por el modelo para el control cruzado de argumentos.</w:t>
       </w:r>
     </w:p>
     <w:p>
@@ -3929,7 +3929,7 @@
           <w:sz w:val="22"/>
           <w:szCs w:val="22"/>
         </w:rPr>
-        <w:t xml:space="preserve">Defensa: 31 / 40</w:t>
+        <w:t xml:space="preserve">Defensa: 29 / 40</w:t>
       </w:r>
     </w:p>
     <w:p>
@@ -3945,7 +3945,7 @@
           <w:sz w:val="20"/>
           <w:szCs w:val="20"/>
         </w:rPr>
-        <w:t xml:space="preserve">Arquitectura (8/10). </w:t>
+        <w:t xml:space="preserve">Arquitectura (7/10). </w:t>
       </w:r>
       <w:r>
         <w:rPr>
@@ -3953,7 +3953,7 @@
           <w:sz w:val="20"/>
           <w:szCs w:val="20"/>
         </w:rPr>
-        <w:t xml:space="preserve">Explicó con claridad el flujo y el uso de agentes como herramientas, y conoce otras formas de comunicación entre agentes (A2A y MCP). Para cambiar de proveedor propuso usar un endpoint compatible con OpenAI o un proxy como LiteLLM.</w:t>
+        <w:t xml:space="preserve">Explicó con claridad el flujo y el uso de agentes como herramientas, y conoce otras formas de comunicación entre agentes (A2A y MCP). Para cambiar de proveedor propuso usar un endpoint compatible con OpenAI o un proxy como LiteLLM. Al hablar de la organización del código, su conocimiento de arquitectura de software fue básico: confundió patrones de diseño con estilos de arquitectura (monolito, microservicios).</w:t>
       </w:r>
     </w:p>
     <w:p>
@@ -4041,7 +4041,7 @@
           <w:sz w:val="20"/>
           <w:szCs w:val="20"/>
         </w:rPr>
-        <w:t xml:space="preserve">Trade-offs (6/8). </w:t>
+        <w:t xml:space="preserve">Trade-offs (5/8). </w:t>
       </w:r>
       <w:r>
         <w:rPr>
@@ -4049,7 +4049,7 @@
           <w:sz w:val="20"/>
           <w:szCs w:val="20"/>
         </w:rPr>
-        <w:t xml:space="preserve">Identificó como mejoras la trazabilidad persistente (por ejemplo con Langfuse), un proxy de modelos con balanceo entre proveedores, pruebas de carga por agente y limitación de peticiones por IP con bloqueo progresivo. No conocía el patrón circuit breaker y recordó pocos patrones de diseño.</w:t>
+        <w:t xml:space="preserve">Identificó como mejoras la trazabilidad persistente (por ejemplo con Langfuse), un proxy de modelos con balanceo entre proveedores, pruebas de carga por agente y limitación de peticiones por IP con bloqueo progresivo. Describe prácticas de resiliencia por experiencia (bloqueo progresivo, manejo de errores), pero no reconoció el patrón circuit breaker por su nombre, y de patrones de diseño solo recordó Factory de forma superficial.</w:t>
       </w:r>
     </w:p>
     <w:p>
@@ -4091,11 +4091,12 @@
           <w:sz w:val="20"/>
           <w:szCs w:val="20"/>
         </w:rPr>
-        <w:t xml:space="preserve">Debe reforzar autenticación y autorización por cliente, resiliencia ante fallos del proveedor de modelos (reintentos, circuit breaker, fallback entre proveedores), persistencia del estado y de las trazas, y que los datos sensibles no pasen por el modelo.</w:t>
+        <w:t xml:space="preserve">Debe reforzar fundamentos de ingeniería de software (patrones de diseño, arquitectura por capas, patrones de resiliencia), autenticación y autorización por cliente, resiliencia ante fallos del proveedor de modelos, persistencia del estado y de las trazas, y que los datos sensibles no pasen por el modelo.</w:t>
       </w:r>
     </w:p>
     <w:p>
       <w:pPr>
+        <w:pageBreakBefore/>
         <w:rPr>
           <w:rFonts w:ascii="Roboto Slab" w:eastAsia="Roboto Slab" w:hAnsi="Roboto Slab" w:cs="Roboto Slab"/>
           <w:b/>
@@ -4202,7 +4203,7 @@
                 <w:sz w:val="22"/>
                 <w:szCs w:val="22"/>
               </w:rPr>
-              <w:t xml:space="preserve">Buen proceso: especificación de tareas, ramas, pull requests y pruebas. Recordó pocos patrones de diseño y no conocía el patrón circuit breaker.</w:t>
+              <w:t xml:space="preserve">Buen proceso: instrucción inicial con contexto y planificación, ramas, pull requests y pruebas. Patrones de diseño y arquitectura de software en nivel básico; diseño sin capas.</w:t>
             </w:r>
           </w:p>
         </w:tc>

</xml_diff>

<commit_message>
Informe de Mike Bermeo: nota final solo con la prueba práctica
Co-Authored-By: Claude Opus 5.5 <noreply@anthropic.com>
Claude-Session: https://claude.ai/code/session_01XoDZLsg3S6BNvJBdoo6Rq7
</commit_message>
<xml_diff>
--- a/informes/Informe_entrevista_Mike_Bermeo.docx
+++ b/informes/Informe_entrevista_Mike_Bermeo.docx
@@ -981,8 +981,11 @@
             <w:r>
               <w:rPr>
                 <w:rFonts w:ascii="Roboto Slab" w:eastAsia="Roboto Slab" w:hAnsi="Roboto Slab" w:cs="Roboto Slab"/>
-              </w:rPr>
-              <w:t xml:space="preserve">Por definir</w:t>
+                <w:b/>
+                <w:bCs/>
+                <w:color w:val="1E7B34"/>
+              </w:rPr>
+              <w:t xml:space="preserve">SI</w:t>
             </w:r>
           </w:p>
         </w:tc>
@@ -1515,11 +1518,11 @@
                 <w:rFonts w:ascii="Segoe UI" w:hAnsi="Segoe UI" w:cs="Segoe UI"/>
                 <w:b/>
                 <w:bCs/>
-                <w:color w:val="1F3864"/>
+                <w:color w:val="375623"/>
                 <w:sz w:val="22"/>
                 <w:szCs w:val="22"/>
               </w:rPr>
-              <w:t xml:space="preserve">PRÁCTICA 71 / 100</w:t>
+              <w:t xml:space="preserve">INGENIERO SOFTWARE IA – 71 / 100</w:t>
             </w:r>
           </w:p>
         </w:tc>
@@ -1885,7 +1888,7 @@
           <w:sz w:val="20"/>
           <w:szCs w:val="20"/>
         </w:rPr>
-        <w:t xml:space="preserve">La prueba práctica suma 71/100 (diseño 12/20, implementación 30/40, defensa 29/40). Entregó una solución funcional y desplegada, con la decisión bancaria aplicada en código: el modelo puede ser más conservador que la política, nunca menos. En la defensa explicó su solución con precisión y respondió con criterio sobre proveedores de modelos, observabilidad, RAG, datos sensibles y despliegue. Las brechas principales son la ausencia de autenticación y de control de acceso por cliente, la falta de mecanismos de resiliencia ante fallos del proveedor de modelos, un diseño que describe el flujo de agentes sin capas de software, y fundamentos de ingeniería de software (patrones de diseño, arquitectura, patrones de resiliencia) en un nivel básico. La nota final queda pendiente de la evaluación teórica.</w:t>
+        <w:t xml:space="preserve">La prueba práctica suma 71/100 (diseño 12/20, implementación 30/40, defensa 29/40). Entregó una solución funcional y desplegada, con la decisión bancaria aplicada en código: el modelo puede ser más conservador que la política, nunca menos. En la defensa explicó su solución con precisión y respondió con criterio sobre proveedores de modelos, observabilidad, RAG, datos sensibles y despliegue. Las brechas principales son la ausencia de autenticación y de control de acceso por cliente, la falta de mecanismos de resiliencia ante fallos del proveedor de modelos, un diseño que describe el flujo de agentes sin capas de software, y fundamentos de ingeniería de software (patrones de diseño, arquitectura, patrones de resiliencia) en un nivel básico. No se tomó prueba teórica, por lo que la nota final corresponde a la prueba práctica.</w:t>
       </w:r>
     </w:p>
     <w:p>
@@ -2052,7 +2055,7 @@
                 <w:sz w:val="19"/>
                 <w:szCs w:val="19"/>
               </w:rPr>
-              <w:t xml:space="preserve">Evaluación teórica</w:t>
+              <w:t xml:space="preserve">Diseño de arquitectura</w:t>
             </w:r>
           </w:p>
         </w:tc>
@@ -2072,7 +2075,7 @@
                 <w:sz w:val="19"/>
                 <w:szCs w:val="19"/>
               </w:rPr>
-              <w:t xml:space="preserve">[Por completar]</w:t>
+              <w:t xml:space="preserve">12 / 20</w:t>
             </w:r>
           </w:p>
         </w:tc>
@@ -2097,7 +2100,7 @@
                 <w:sz w:val="19"/>
                 <w:szCs w:val="19"/>
               </w:rPr>
-              <w:t xml:space="preserve">Diseño de arquitectura</w:t>
+              <w:t xml:space="preserve">Implementación</w:t>
             </w:r>
           </w:p>
         </w:tc>
@@ -2117,7 +2120,7 @@
                 <w:sz w:val="19"/>
                 <w:szCs w:val="19"/>
               </w:rPr>
-              <w:t xml:space="preserve">12 / 20</w:t>
+              <w:t xml:space="preserve">30 / 40</w:t>
             </w:r>
           </w:p>
         </w:tc>
@@ -2142,7 +2145,7 @@
                 <w:sz w:val="19"/>
                 <w:szCs w:val="19"/>
               </w:rPr>
-              <w:t xml:space="preserve">Implementación</w:t>
+              <w:t xml:space="preserve">Defensa</w:t>
             </w:r>
           </w:p>
         </w:tc>
@@ -2162,7 +2165,7 @@
                 <w:sz w:val="19"/>
                 <w:szCs w:val="19"/>
               </w:rPr>
-              <w:t xml:space="preserve">30 / 40</w:t>
+              <w:t xml:space="preserve">29 / 40</w:t>
             </w:r>
           </w:p>
         </w:tc>
@@ -2174,6 +2177,7 @@
         <w:tc>
           <w:tcPr>
             <w:tcW w:w="6000" w:type="dxa"/>
+            <w:shd w:val="clear" w:color="auto" w:fill="F2F2F2"/>
             <w:vAlign w:val="center"/>
           </w:tcPr>
           <w:p>
@@ -2184,16 +2188,19 @@
             <w:r>
               <w:rPr>
                 <w:rFonts w:ascii="Roboto Slab" w:eastAsia="Roboto Slab" w:hAnsi="Roboto Slab" w:cs="Roboto Slab"/>
-                <w:sz w:val="19"/>
-                <w:szCs w:val="19"/>
-              </w:rPr>
-              <w:t xml:space="preserve">Defensa</w:t>
+                <w:b/>
+                <w:bCs/>
+                <w:sz w:val="19"/>
+                <w:szCs w:val="19"/>
+              </w:rPr>
+              <w:t xml:space="preserve">Total prueba práctica</w:t>
             </w:r>
           </w:p>
         </w:tc>
         <w:tc>
           <w:tcPr>
             <w:tcW w:w="3019" w:type="dxa"/>
+            <w:shd w:val="clear" w:color="auto" w:fill="F2F2F2"/>
             <w:vAlign w:val="center"/>
           </w:tcPr>
           <w:p>
@@ -2204,10 +2211,12 @@
             <w:r>
               <w:rPr>
                 <w:rFonts w:ascii="Roboto Slab" w:eastAsia="Roboto Slab" w:hAnsi="Roboto Slab" w:cs="Roboto Slab"/>
-                <w:sz w:val="19"/>
-                <w:szCs w:val="19"/>
-              </w:rPr>
-              <w:t xml:space="preserve">29 / 40</w:t>
+                <w:b/>
+                <w:bCs/>
+                <w:sz w:val="19"/>
+                <w:szCs w:val="19"/>
+              </w:rPr>
+              <w:t xml:space="preserve">71 / 100</w:t>
             </w:r>
           </w:p>
         </w:tc>
@@ -2235,7 +2244,7 @@
                 <w:sz w:val="19"/>
                 <w:szCs w:val="19"/>
               </w:rPr>
-              <w:t xml:space="preserve">Total prueba práctica</w:t>
+              <w:t xml:space="preserve">Nota final (solo prueba práctica)</w:t>
             </w:r>
           </w:p>
         </w:tc>
@@ -2259,57 +2268,6 @@
                 <w:szCs w:val="19"/>
               </w:rPr>
               <w:t xml:space="preserve">71 / 100</w:t>
-            </w:r>
-          </w:p>
-        </w:tc>
-      </w:tr>
-      <w:tr>
-        <w:trPr>
-          <w:cantSplit/>
-        </w:trPr>
-        <w:tc>
-          <w:tcPr>
-            <w:tcW w:w="6000" w:type="dxa"/>
-            <w:shd w:val="clear" w:color="auto" w:fill="F2F2F2"/>
-            <w:vAlign w:val="center"/>
-          </w:tcPr>
-          <w:p>
-            <w:pPr>
-              <w:spacing w:before="40" w:after="40" w:line="240" w:lineRule="auto"/>
-              <w:jc w:val="left"/>
-            </w:pPr>
-            <w:r>
-              <w:rPr>
-                <w:rFonts w:ascii="Roboto Slab" w:eastAsia="Roboto Slab" w:hAnsi="Roboto Slab" w:cs="Roboto Slab"/>
-                <w:b/>
-                <w:bCs/>
-                <w:sz w:val="19"/>
-                <w:szCs w:val="19"/>
-              </w:rPr>
-              <w:t xml:space="preserve">Nota final (teórica + práctica)</w:t>
-            </w:r>
-          </w:p>
-        </w:tc>
-        <w:tc>
-          <w:tcPr>
-            <w:tcW w:w="3019" w:type="dxa"/>
-            <w:shd w:val="clear" w:color="auto" w:fill="F2F2F2"/>
-            <w:vAlign w:val="center"/>
-          </w:tcPr>
-          <w:p>
-            <w:pPr>
-              <w:spacing w:before="40" w:after="40" w:line="240" w:lineRule="auto"/>
-              <w:jc w:val="center"/>
-            </w:pPr>
-            <w:r>
-              <w:rPr>
-                <w:rFonts w:ascii="Roboto Slab" w:eastAsia="Roboto Slab" w:hAnsi="Roboto Slab" w:cs="Roboto Slab"/>
-                <w:b/>
-                <w:bCs/>
-                <w:sz w:val="19"/>
-                <w:szCs w:val="19"/>
-              </w:rPr>
-              <w:t xml:space="preserve">Pendiente</w:t>
             </w:r>
           </w:p>
         </w:tc>
@@ -4077,7 +4035,7 @@
           <w:sz w:val="20"/>
           <w:szCs w:val="20"/>
         </w:rPr>
-        <w:t xml:space="preserve">Se recomienda continuar en el proceso, sujeto a la nota teórica. Entregó una solución funcional y desplegada en la que la decisión de negocio no depende del modelo, con controles de herramientas, validación cruzada de argumentos y pruebas automatizadas, y defendió sus decisiones con precisión.</w:t>
+        <w:t xml:space="preserve">Se recomienda continuar en el proceso. Entregó una solución funcional y desplegada en la que la decisión de negocio no depende del modelo, con controles de herramientas, validación cruzada de argumentos y pruebas automatizadas, y defendió sus decisiones con precisión.</w:t>
       </w:r>
     </w:p>
     <w:p>

</xml_diff>